<commit_message>
chore: Update Project Result Report File(ID12, ID13)
</commit_message>
<xml_diff>
--- a/모바일웹서비스 프로젝트_공통평가 01_수행 결과 보고서.docx
+++ b/모바일웹서비스 프로젝트_공통평가 01_수행 결과 보고서.docx
@@ -1195,8 +1195,8 @@
                 <w:sz w:val="12"/>
                 <w:szCs w:val="12"/>
               </w:rPr>
-              <w:pict w14:anchorId="7D979F24">
-                <v:shape id="그림 1" o:spid="_x0000_i1028" type="#_x0000_t75" style="width:105.6pt;height:68.4pt;visibility:visible;mso-wrap-style:square">
+              <w:pict w14:anchorId="679581A3">
+                <v:shape id="그림 1" o:spid="_x0000_i1076" type="#_x0000_t75" style="width:105.6pt;height:68.4pt;visibility:visible;mso-wrap-style:square">
                   <v:imagedata r:id="rId8" o:title=""/>
                 </v:shape>
               </w:pict>
@@ -1792,8 +1792,8 @@
                 <w:sz w:val="12"/>
                 <w:szCs w:val="12"/>
               </w:rPr>
-              <w:pict w14:anchorId="3CC1280E">
-                <v:shape id="_x0000_i1029" type="#_x0000_t75" style="width:106.2pt;height:60pt;visibility:visible;mso-wrap-style:square">
+              <w:pict w14:anchorId="6D9B30B7">
+                <v:shape id="_x0000_i1077" type="#_x0000_t75" style="width:106.2pt;height:60pt;visibility:visible;mso-wrap-style:square">
                   <v:imagedata r:id="rId9" o:title=""/>
                 </v:shape>
               </w:pict>
@@ -1830,8 +1830,8 @@
                 <w:sz w:val="12"/>
                 <w:szCs w:val="12"/>
               </w:rPr>
-              <w:pict w14:anchorId="592A8437">
-                <v:shape id="_x0000_i1030" type="#_x0000_t75" style="width:106.8pt;height:60pt;visibility:visible;mso-wrap-style:square">
+              <w:pict w14:anchorId="75A8C8E6">
+                <v:shape id="_x0000_i1078" type="#_x0000_t75" style="width:106.8pt;height:60pt;visibility:visible;mso-wrap-style:square">
                   <v:imagedata r:id="rId10" o:title=""/>
                 </v:shape>
               </w:pict>
@@ -2056,8 +2056,8 @@
                 <w:sz w:val="12"/>
                 <w:szCs w:val="12"/>
               </w:rPr>
-              <w:pict w14:anchorId="4F1F17BC">
-                <v:shape id="_x0000_i1031" type="#_x0000_t75" style="width:105.6pt;height:56.4pt;visibility:visible;mso-wrap-style:square">
+              <w:pict w14:anchorId="67301976">
+                <v:shape id="_x0000_i1079" type="#_x0000_t75" style="width:105.6pt;height:56.4pt;visibility:visible;mso-wrap-style:square">
                   <v:imagedata r:id="rId11" o:title=""/>
                 </v:shape>
               </w:pict>
@@ -2297,8 +2297,8 @@
                 <w:sz w:val="12"/>
                 <w:szCs w:val="12"/>
               </w:rPr>
-              <w:pict w14:anchorId="76DE5465">
-                <v:shape id="_x0000_i1032" type="#_x0000_t75" style="width:106.8pt;height:60pt;visibility:visible;mso-wrap-style:square">
+              <w:pict w14:anchorId="3B4DB216">
+                <v:shape id="_x0000_i1080" type="#_x0000_t75" style="width:106.8pt;height:60pt;visibility:visible;mso-wrap-style:square">
                   <v:imagedata r:id="rId13" o:title=""/>
                 </v:shape>
               </w:pict>
@@ -2590,8 +2590,8 @@
                 <w:sz w:val="12"/>
                 <w:szCs w:val="12"/>
               </w:rPr>
-              <w:pict w14:anchorId="4A58A35F">
-                <v:shape id="_x0000_i1033" type="#_x0000_t75" style="width:106.8pt;height:60pt;visibility:visible;mso-wrap-style:square">
+              <w:pict w14:anchorId="2EB5D740">
+                <v:shape id="_x0000_i1081" type="#_x0000_t75" style="width:106.8pt;height:60pt;visibility:visible;mso-wrap-style:square">
                   <v:imagedata r:id="rId14" o:title=""/>
                 </v:shape>
               </w:pict>
@@ -2888,8 +2888,8 @@
                 <w:sz w:val="12"/>
                 <w:szCs w:val="12"/>
               </w:rPr>
-              <w:pict w14:anchorId="458056F1">
-                <v:shape id="_x0000_i1045" type="#_x0000_t75" style="width:106.8pt;height:60pt;visibility:visible;mso-wrap-style:square">
+              <w:pict w14:anchorId="110F8340">
+                <v:shape id="_x0000_i1093" type="#_x0000_t75" style="width:106.8pt;height:60pt;visibility:visible;mso-wrap-style:square">
                   <v:imagedata r:id="rId15" o:title=""/>
                 </v:shape>
               </w:pict>
@@ -3141,8 +3141,8 @@
                 <w:sz w:val="12"/>
                 <w:szCs w:val="12"/>
               </w:rPr>
-              <w:pict w14:anchorId="679436D0">
-                <v:shape id="_x0000_i1034" type="#_x0000_t75" style="width:106.8pt;height:60pt;visibility:visible;mso-wrap-style:square">
+              <w:pict w14:anchorId="1B2AEF4A">
+                <v:shape id="_x0000_i1082" type="#_x0000_t75" style="width:106.8pt;height:60pt;visibility:visible;mso-wrap-style:square">
                   <v:imagedata r:id="rId16" o:title=""/>
                 </v:shape>
               </w:pict>
@@ -3371,8 +3371,8 @@
                 <w:sz w:val="12"/>
                 <w:szCs w:val="12"/>
               </w:rPr>
-              <w:pict w14:anchorId="3C07AC8B">
-                <v:shape id="_x0000_i1035" type="#_x0000_t75" style="width:106.8pt;height:60pt;visibility:visible;mso-wrap-style:square">
+              <w:pict w14:anchorId="592AB6D5">
+                <v:shape id="_x0000_i1083" type="#_x0000_t75" style="width:106.8pt;height:60pt;visibility:visible;mso-wrap-style:square">
                   <v:imagedata r:id="rId17" o:title=""/>
                 </v:shape>
               </w:pict>
@@ -3625,8 +3625,8 @@
                 <w:sz w:val="12"/>
                 <w:szCs w:val="12"/>
               </w:rPr>
-              <w:pict w14:anchorId="0D732851">
-                <v:shape id="_x0000_i1036" type="#_x0000_t75" style="width:106.8pt;height:60pt;visibility:visible;mso-wrap-style:square">
+              <w:pict w14:anchorId="56B4F81F">
+                <v:shape id="_x0000_i1084" type="#_x0000_t75" style="width:106.8pt;height:60pt;visibility:visible;mso-wrap-style:square">
                   <v:imagedata r:id="rId18" o:title=""/>
                 </v:shape>
               </w:pict>
@@ -4149,8 +4149,8 @@
                 <w:sz w:val="12"/>
                 <w:szCs w:val="12"/>
               </w:rPr>
-              <w:pict w14:anchorId="15DE5A69">
-                <v:shape id="_x0000_i1047" type="#_x0000_t75" style="width:106.2pt;height:240.6pt;visibility:visible;mso-wrap-style:square">
+              <w:pict w14:anchorId="779FA8EE">
+                <v:shape id="_x0000_i1095" type="#_x0000_t75" style="width:106.2pt;height:240.6pt;visibility:visible;mso-wrap-style:square">
                   <v:imagedata r:id="rId19" o:title=""/>
                 </v:shape>
               </w:pict>
@@ -4200,8 +4200,8 @@
                 <w:szCs w:val="12"/>
               </w:rPr>
               <w:lastRenderedPageBreak/>
-              <w:pict w14:anchorId="0E3F1D5A">
-                <v:shape id="_x0000_i1048" type="#_x0000_t75" style="width:106.8pt;height:56.4pt;visibility:visible;mso-wrap-style:square">
+              <w:pict w14:anchorId="4320B356">
+                <v:shape id="_x0000_i1096" type="#_x0000_t75" style="width:106.8pt;height:56.4pt;visibility:visible;mso-wrap-style:square">
                   <v:imagedata r:id="rId20" o:title=""/>
                 </v:shape>
               </w:pict>
@@ -4402,6 +4402,14 @@
                 <w:szCs w:val="12"/>
               </w:rPr>
             </w:pPr>
+            <w:r>
+              <w:rPr>
+                <w:rFonts w:hint="eastAsia"/>
+                <w:sz w:val="12"/>
+                <w:szCs w:val="12"/>
+              </w:rPr>
+              <w:t>O</w:t>
+            </w:r>
           </w:p>
         </w:tc>
         <w:tc>
@@ -4434,6 +4442,21 @@
                 <w:szCs w:val="12"/>
               </w:rPr>
             </w:pPr>
+            <w:r>
+              <w:rPr>
+                <w:rFonts w:cs="Times New Roman"/>
+                <w:noProof/>
+                <w:color w:val="auto"/>
+                <w:kern w:val="2"/>
+                <w:sz w:val="12"/>
+                <w:szCs w:val="12"/>
+              </w:rPr>
+              <w:pict w14:anchorId="588CD444">
+                <v:shape id="_x0000_i1102" type="#_x0000_t75" style="width:106.8pt;height:60pt;visibility:visible;mso-wrap-style:square">
+                  <v:imagedata r:id="rId21" o:title=""/>
+                </v:shape>
+              </w:pict>
+            </w:r>
           </w:p>
         </w:tc>
       </w:tr>
@@ -4629,6 +4652,14 @@
                 <w:szCs w:val="12"/>
               </w:rPr>
             </w:pPr>
+            <w:r>
+              <w:rPr>
+                <w:rFonts w:hint="eastAsia"/>
+                <w:sz w:val="12"/>
+                <w:szCs w:val="12"/>
+              </w:rPr>
+              <w:t>O</w:t>
+            </w:r>
           </w:p>
         </w:tc>
         <w:tc>
@@ -4661,6 +4692,21 @@
                 <w:szCs w:val="12"/>
               </w:rPr>
             </w:pPr>
+            <w:r>
+              <w:rPr>
+                <w:rFonts w:cs="Times New Roman"/>
+                <w:noProof/>
+                <w:color w:val="auto"/>
+                <w:kern w:val="2"/>
+                <w:sz w:val="12"/>
+                <w:szCs w:val="12"/>
+              </w:rPr>
+              <w:pict w14:anchorId="2DB80F5E">
+                <v:shape id="_x0000_i1103" type="#_x0000_t75" style="width:106.2pt;height:60pt;visibility:visible;mso-wrap-style:square">
+                  <v:imagedata r:id="rId22" o:title=""/>
+                </v:shape>
+              </w:pict>
+            </w:r>
           </w:p>
         </w:tc>
       </w:tr>
@@ -5372,8 +5418,9 @@
           <w:sz w:val="12"/>
           <w:szCs w:val="12"/>
         </w:rPr>
-        <w:pict w14:anchorId="2655C9CF">
-          <v:shape id="_x0000_i1052" type="#_x0000_t75" style="width:420.6pt;height:273pt;visibility:visible;mso-wrap-style:square">
+        <w:lastRenderedPageBreak/>
+        <w:pict w14:anchorId="09325AC0">
+          <v:shape id="_x0000_i1100" type="#_x0000_t75" style="width:420.6pt;height:273pt;visibility:visible;mso-wrap-style:square">
             <v:imagedata r:id="rId8" o:title=""/>
           </v:shape>
         </w:pict>
@@ -5437,7 +5484,6 @@
           <w:szCs w:val="22"/>
           <w:lang w:val="en-US"/>
         </w:rPr>
-        <w:lastRenderedPageBreak/>
         <w:t>https://github.com/wlstp8473/KHU_MobileWebProject_Midterm_Evaluation_01.git</w:t>
       </w:r>
     </w:p>
@@ -5461,9 +5507,9 @@
           <w:szCs w:val="22"/>
           <w:lang w:val="en-US"/>
         </w:rPr>
-        <w:pict w14:anchorId="442BC1F2">
-          <v:shape id="_x0000_i1051" type="#_x0000_t75" style="width:460.8pt;height:228.6pt;visibility:visible;mso-wrap-style:square">
-            <v:imagedata r:id="rId21" o:title=""/>
+        <w:pict w14:anchorId="6BD023CE">
+          <v:shape id="_x0000_i1099" type="#_x0000_t75" style="width:460.8pt;height:228.6pt;visibility:visible;mso-wrap-style:square">
+            <v:imagedata r:id="rId23" o:title=""/>
           </v:shape>
         </w:pict>
       </w:r>
@@ -5503,7 +5549,7 @@
           <w:szCs w:val="22"/>
           <w:lang w:val="en-US"/>
         </w:rPr>
-        <w:t xml:space="preserve">3. 증빙 자료 </w:t>
+        <w:t>3. 증빙 자료 Ok</w:t>
       </w:r>
     </w:p>
     <w:p>
@@ -5518,8 +5564,9 @@
         <w:rPr>
           <w:noProof/>
         </w:rPr>
-        <w:pict w14:anchorId="5DBC4025">
-          <v:shape id="_x0000_i1037" type="#_x0000_t75" style="width:286.2pt;height:160.8pt;visibility:visible;mso-wrap-style:square">
+        <w:lastRenderedPageBreak/>
+        <w:pict w14:anchorId="2AFA8E8C">
+          <v:shape id="_x0000_i1085" type="#_x0000_t75" style="width:286.2pt;height:160.8pt;visibility:visible;mso-wrap-style:square">
             <v:imagedata r:id="rId9" o:title=""/>
           </v:shape>
         </w:pict>
@@ -5545,8 +5592,8 @@
           <w:szCs w:val="22"/>
           <w:lang w:val="en-US"/>
         </w:rPr>
-        <w:pict w14:anchorId="19F5C67A">
-          <v:shape id="_x0000_i1038" type="#_x0000_t75" style="width:292.2pt;height:165pt;visibility:visible;mso-wrap-style:square">
+        <w:pict w14:anchorId="693B5C4F">
+          <v:shape id="_x0000_i1086" type="#_x0000_t75" style="width:292.2pt;height:165pt;visibility:visible;mso-wrap-style:square">
             <v:imagedata r:id="rId10" o:title=""/>
           </v:shape>
         </w:pict>
@@ -5597,8 +5644,7 @@
           <w:szCs w:val="22"/>
           <w:lang w:val="en-US"/>
         </w:rPr>
-        <w:lastRenderedPageBreak/>
-        <w:t xml:space="preserve">4. 증빙 자료 </w:t>
+        <w:t>4. 증빙 자료 Ok</w:t>
       </w:r>
     </w:p>
     <w:p>
@@ -5621,8 +5667,8 @@
           <w:szCs w:val="22"/>
           <w:lang w:val="en-US"/>
         </w:rPr>
-        <w:pict w14:anchorId="04CBF38A">
-          <v:shape id="_x0000_i1039" type="#_x0000_t75" style="width:265.2pt;height:142.2pt;visibility:visible;mso-wrap-style:square">
+        <w:pict w14:anchorId="25513F88">
+          <v:shape id="_x0000_i1087" type="#_x0000_t75" style="width:265.2pt;height:142.2pt;visibility:visible;mso-wrap-style:square">
             <v:imagedata r:id="rId11" o:title=""/>
           </v:shape>
         </w:pict>
@@ -5664,7 +5710,7 @@
           <w:szCs w:val="22"/>
           <w:lang w:val="en-US"/>
         </w:rPr>
-        <w:t xml:space="preserve">5. 증빙 자료 </w:t>
+        <w:t>5. 증빙 자료 Ok</w:t>
       </w:r>
     </w:p>
     <w:p>
@@ -5687,8 +5733,9 @@
           <w:szCs w:val="22"/>
           <w:lang w:val="en-US"/>
         </w:rPr>
-        <w:pict w14:anchorId="1F4AB7F9">
-          <v:shape id="_x0000_i1040" type="#_x0000_t75" style="width:343.8pt;height:193.2pt;visibility:visible;mso-wrap-style:square">
+        <w:lastRenderedPageBreak/>
+        <w:pict w14:anchorId="38FF0F69">
+          <v:shape id="_x0000_i1088" type="#_x0000_t75" style="width:343.8pt;height:193.2pt;visibility:visible;mso-wrap-style:square">
             <v:imagedata r:id="rId13" o:title=""/>
           </v:shape>
         </w:pict>
@@ -5752,8 +5799,8 @@
           <w:szCs w:val="22"/>
           <w:lang w:val="en-US"/>
         </w:rPr>
-        <w:pict w14:anchorId="10807FD6">
-          <v:shape id="_x0000_i1041" type="#_x0000_t75" style="width:322.2pt;height:181.2pt;visibility:visible;mso-wrap-style:square">
+        <w:pict w14:anchorId="2BFF022B">
+          <v:shape id="_x0000_i1089" type="#_x0000_t75" style="width:322.2pt;height:181.2pt;visibility:visible;mso-wrap-style:square">
             <v:imagedata r:id="rId14" o:title=""/>
           </v:shape>
         </w:pict>
@@ -5814,9 +5861,9 @@
           <w:lang w:val="en-US"/>
         </w:rPr>
         <w:lastRenderedPageBreak/>
-        <w:pict w14:anchorId="2CB4E6F2">
-          <v:shape id="_x0000_i1046" type="#_x0000_t75" style="width:460.8pt;height:259.2pt">
-            <v:imagedata r:id="rId22" o:title=""/>
+        <w:pict w14:anchorId="7102E8FC">
+          <v:shape id="_x0000_i1094" type="#_x0000_t75" style="width:460.8pt;height:259.2pt">
+            <v:imagedata r:id="rId24" o:title=""/>
           </v:shape>
         </w:pict>
       </w:r>
@@ -5876,8 +5923,8 @@
           <w:szCs w:val="22"/>
           <w:lang w:val="en-US"/>
         </w:rPr>
-        <w:pict w14:anchorId="330CA037">
-          <v:shape id="_x0000_i1042" type="#_x0000_t75" style="width:460.8pt;height:259.2pt;visibility:visible;mso-wrap-style:square">
+        <w:pict w14:anchorId="17B102B0">
+          <v:shape id="_x0000_i1090" type="#_x0000_t75" style="width:460.8pt;height:259.2pt;visibility:visible;mso-wrap-style:square">
             <v:imagedata r:id="rId16" o:title=""/>
           </v:shape>
         </w:pict>
@@ -5938,8 +5985,8 @@
           <w:lang w:val="en-US"/>
         </w:rPr>
         <w:lastRenderedPageBreak/>
-        <w:pict w14:anchorId="066B30B5">
-          <v:shape id="_x0000_i1043" type="#_x0000_t75" style="width:450.6pt;height:255pt;visibility:visible;mso-wrap-style:square">
+        <w:pict w14:anchorId="7CC0C637">
+          <v:shape id="_x0000_i1091" type="#_x0000_t75" style="width:450.6pt;height:255pt;visibility:visible;mso-wrap-style:square">
             <v:imagedata r:id="rId17" o:title=""/>
           </v:shape>
         </w:pict>
@@ -6000,8 +6047,8 @@
           <w:szCs w:val="22"/>
           <w:lang w:val="en-US"/>
         </w:rPr>
-        <w:pict w14:anchorId="5938313F">
-          <v:shape id="_x0000_i1044" type="#_x0000_t75" style="width:413.4pt;height:232.2pt;visibility:visible;mso-wrap-style:square">
+        <w:pict w14:anchorId="0A813999">
+          <v:shape id="_x0000_i1092" type="#_x0000_t75" style="width:413.4pt;height:232.2pt;visibility:visible;mso-wrap-style:square">
             <v:imagedata r:id="rId18" o:title=""/>
           </v:shape>
         </w:pict>
@@ -6060,11 +6107,142 @@
           <w:noProof/>
         </w:rPr>
         <w:lastRenderedPageBreak/>
-        <w:pict w14:anchorId="5BC61F24">
-          <v:shape id="_x0000_i1050" type="#_x0000_t75" style="width:293.4pt;height:667.2pt;visibility:visible;mso-wrap-style:square">
-            <v:imagedata r:id="rId23" o:title=""/>
+        <w:pict w14:anchorId="1A8B61C0">
+          <v:shape id="_x0000_i1098" type="#_x0000_t75" style="width:293.4pt;height:667.2pt;visibility:visible;mso-wrap-style:square">
+            <v:imagedata r:id="rId25" o:title=""/>
           </v:shape>
         </w:pict>
+      </w:r>
+    </w:p>
+    <w:p>
+      <w:pPr>
+        <w:pStyle w:val="aff8"/>
+        <w:ind w:firstLineChars="0"/>
+        <w:jc w:val="left"/>
+        <w:outlineLvl w:val="0"/>
+        <w:rPr>
+          <w:b/>
+          <w:noProof/>
+          <w:szCs w:val="22"/>
+          <w:lang w:val="en-US"/>
+        </w:rPr>
+      </w:pPr>
+      <w:r>
+        <w:rPr>
+          <w:b/>
+          <w:noProof/>
+          <w:szCs w:val="22"/>
+          <w:lang w:val="en-US"/>
+        </w:rPr>
+        <w:lastRenderedPageBreak/>
+        <w:pict w14:anchorId="7031BAF2">
+          <v:shape id="_x0000_i1097" type="#_x0000_t75" style="width:460.8pt;height:244.8pt;visibility:visible;mso-wrap-style:square">
+            <v:imagedata r:id="rId20" o:title=""/>
+          </v:shape>
+        </w:pict>
+      </w:r>
+    </w:p>
+    <w:p>
+      <w:pPr>
+        <w:pStyle w:val="aff8"/>
+        <w:ind w:firstLineChars="0"/>
+        <w:jc w:val="left"/>
+        <w:outlineLvl w:val="0"/>
+        <w:rPr>
+          <w:b/>
+          <w:noProof/>
+          <w:szCs w:val="22"/>
+          <w:lang w:val="en-US"/>
+        </w:rPr>
+      </w:pPr>
+    </w:p>
+    <w:p>
+      <w:pPr>
+        <w:pStyle w:val="aff8"/>
+        <w:ind w:firstLineChars="0"/>
+        <w:jc w:val="left"/>
+        <w:outlineLvl w:val="0"/>
+        <w:rPr>
+          <w:b/>
+          <w:noProof/>
+          <w:szCs w:val="22"/>
+          <w:lang w:val="en-US"/>
+        </w:rPr>
+      </w:pPr>
+      <w:r>
+        <w:rPr>
+          <w:rFonts w:hint="eastAsia"/>
+          <w:b/>
+          <w:noProof/>
+          <w:szCs w:val="22"/>
+          <w:lang w:val="en-US"/>
+        </w:rPr>
+        <w:t>12. 증빙 자료</w:t>
+      </w:r>
+    </w:p>
+    <w:p>
+      <w:pPr>
+        <w:pStyle w:val="aff8"/>
+        <w:ind w:firstLineChars="0"/>
+        <w:jc w:val="left"/>
+        <w:outlineLvl w:val="0"/>
+        <w:rPr>
+          <w:b/>
+          <w:noProof/>
+          <w:szCs w:val="22"/>
+          <w:lang w:val="en-US"/>
+        </w:rPr>
+      </w:pPr>
+      <w:r>
+        <w:rPr>
+          <w:b/>
+          <w:noProof/>
+          <w:szCs w:val="22"/>
+          <w:lang w:val="en-US"/>
+        </w:rPr>
+        <w:pict w14:anchorId="3EDDB898">
+          <v:shape id="_x0000_i1101" type="#_x0000_t75" style="width:460.8pt;height:259.2pt;visibility:visible;mso-wrap-style:square">
+            <v:imagedata r:id="rId21" o:title=""/>
+          </v:shape>
+        </w:pict>
+      </w:r>
+    </w:p>
+    <w:p>
+      <w:pPr>
+        <w:pStyle w:val="aff8"/>
+        <w:ind w:firstLineChars="0"/>
+        <w:jc w:val="left"/>
+        <w:outlineLvl w:val="0"/>
+        <w:rPr>
+          <w:b/>
+          <w:noProof/>
+          <w:szCs w:val="22"/>
+          <w:lang w:val="en-US"/>
+        </w:rPr>
+      </w:pPr>
+    </w:p>
+    <w:p>
+      <w:pPr>
+        <w:pStyle w:val="aff8"/>
+        <w:ind w:firstLineChars="0"/>
+        <w:jc w:val="left"/>
+        <w:outlineLvl w:val="0"/>
+        <w:rPr>
+          <w:b/>
+          <w:noProof/>
+          <w:szCs w:val="22"/>
+          <w:lang w:val="en-US"/>
+        </w:rPr>
+      </w:pPr>
+      <w:r>
+        <w:rPr>
+          <w:rFonts w:hint="eastAsia"/>
+          <w:b/>
+          <w:noProof/>
+          <w:szCs w:val="22"/>
+          <w:lang w:val="en-US"/>
+        </w:rPr>
+        <w:t>13. 증빙 자료</w:t>
       </w:r>
     </w:p>
     <w:p>
@@ -6088,18 +6266,18 @@
           <w:lang w:val="en-US"/>
         </w:rPr>
         <w:lastRenderedPageBreak/>
-        <w:pict w14:anchorId="5AA59F70">
-          <v:shape id="_x0000_i1049" type="#_x0000_t75" style="width:460.8pt;height:244.8pt;visibility:visible;mso-wrap-style:square">
-            <v:imagedata r:id="rId20" o:title=""/>
+        <w:pict w14:anchorId="5AFF8199">
+          <v:shape id="_x0000_i1104" type="#_x0000_t75" style="width:460.2pt;height:259.2pt;visibility:visible;mso-wrap-style:square">
+            <v:imagedata r:id="rId22" o:title=""/>
           </v:shape>
         </w:pict>
       </w:r>
     </w:p>
     <w:p/>
     <w:sectPr>
-      <w:headerReference w:type="default" r:id="rId24"/>
-      <w:footerReference w:type="even" r:id="rId25"/>
-      <w:footerReference w:type="default" r:id="rId26"/>
+      <w:headerReference w:type="default" r:id="rId26"/>
+      <w:footerReference w:type="even" r:id="rId27"/>
+      <w:footerReference w:type="default" r:id="rId28"/>
       <w:footnotePr>
         <w:numRestart w:val="eachSect"/>
       </w:footnotePr>

</xml_diff>